<commit_message>
Cap nhat code Timesheet
</commit_message>
<xml_diff>
--- a/src/components/contracts/templates/aeq-pl-dieu-chinh-chuc-vu-luong.docx
+++ b/src/components/contracts/templates/aeq-pl-dieu-chinh-chuc-vu-luong.docx
@@ -1750,7 +1750,7 @@
           <w:bCs/>
           <w:lang w:val="vi-VN"/>
         </w:rPr>
-        <w:t>Kể từ ngày {{Ngày_áp_dụng_text}}</w:t>
+        <w:t>Kể từ ngày {{Ngày_áp_dụng}}</w:t>
       </w:r>
       <w:r>
         <w:rPr>
@@ -1827,7 +1827,7 @@
       </w:r>
       <w:r/>
       <w:r>
-        <w:t>Kể từ ngày {{Ngày_áp_dụng_text}}</w:t>
+        <w:t>Kể từ ngày {{Ngày_áp_dụng}}</w:t>
       </w:r>
       <w:r>
         <w:t xml:space="preserve"> </w:t>

</xml_diff>